<commit_message>
Migration to Phase 2 XT-Streaming document update
</commit_message>
<xml_diff>
--- a/docs/Migration to Phase 2 XT-Streaming.docx
+++ b/docs/Migration to Phase 2 XT-Streaming.docx
@@ -19,7 +19,7 @@
           <w:szCs w:val="28"/>
           <w:rtl w:val="0"/>
         </w:rPr>
-        <w:t xml:space="preserve">Migration to Phase 2 XT-Streaming.</w:t>
+        <w:t xml:space="preserve">Migration to Phase 2 XT-Streaming</w:t>
       </w:r>
     </w:p>
     <w:p>
@@ -87,12 +87,12 @@
           <wp:inline distB="114300" distT="114300" distL="114300" distR="114300">
             <wp:extent cx="5943600" cy="4394200"/>
             <wp:effectExtent b="0" l="0" r="0" t="0"/>
-            <wp:docPr id="1" name="image1.png"/>
+            <wp:docPr id="1" name="image3.png"/>
             <a:graphic>
               <a:graphicData uri="http://schemas.openxmlformats.org/drawingml/2006/picture">
                 <pic:pic>
                   <pic:nvPicPr>
-                    <pic:cNvPr id="0" name="image1.png"/>
+                    <pic:cNvPr id="0" name="image3.png"/>
                     <pic:cNvPicPr preferRelativeResize="0"/>
                   </pic:nvPicPr>
                   <pic:blipFill>
@@ -239,49 +239,10 @@
       </w:pPr>
       <w:r>
         <w:rPr>
-          <w:rtl w:val="0"/>
-        </w:rPr>
-      </w:r>
-    </w:p>
-    <w:p>
-      <w:pPr>
-        <w:spacing w:line="276" w:lineRule="auto"/>
-        <w:rPr>
-          <w:b w:val="1"/>
-        </w:rPr>
-      </w:pPr>
-      <w:r>
-        <w:rPr>
-          <w:rtl w:val="0"/>
-        </w:rPr>
-      </w:r>
-    </w:p>
-    <w:p>
-      <w:pPr>
-        <w:spacing w:line="276" w:lineRule="auto"/>
-        <w:rPr>
-          <w:b w:val="1"/>
-        </w:rPr>
-      </w:pPr>
-      <w:r>
-        <w:rPr>
-          <w:rtl w:val="0"/>
-        </w:rPr>
-      </w:r>
-    </w:p>
-    <w:p>
-      <w:pPr>
-        <w:spacing w:line="276" w:lineRule="auto"/>
-        <w:rPr>
-          <w:b w:val="1"/>
-        </w:rPr>
-      </w:pPr>
-      <w:r>
-        <w:rPr>
-          <w:b w:val="1"/>
-          <w:rtl w:val="0"/>
-        </w:rPr>
-        <w:t xml:space="preserve">STREAM  FLOW BETWEEN MAIN_TCP_SERVER , SUB_TCP_SERVER , VIDEO_TRANSCODING_TOOL and VIDEO PLAYER  (1-1-1-1)</w:t>
+          <w:b w:val="1"/>
+          <w:rtl w:val="0"/>
+        </w:rPr>
+        <w:t xml:space="preserve">STREAM  FLOW BETWEEN TCP FORWARDER, TCP , TRANSCODING TOOL and VIDEO PLAYER  (1-1-1-1)</w:t>
       </w:r>
     </w:p>
     <w:p>
@@ -299,12 +260,12 @@
           <wp:inline distB="114300" distT="114300" distL="114300" distR="114300">
             <wp:extent cx="6806856" cy="7864495"/>
             <wp:effectExtent b="0" l="0" r="0" t="0"/>
-            <wp:docPr id="5" name="image3.png"/>
+            <wp:docPr id="5" name="image1.png"/>
             <a:graphic>
               <a:graphicData uri="http://schemas.openxmlformats.org/drawingml/2006/picture">
                 <pic:pic>
                   <pic:nvPicPr>
-                    <pic:cNvPr id="0" name="image3.png"/>
+                    <pic:cNvPr id="0" name="image1.png"/>
                     <pic:cNvPicPr preferRelativeResize="0"/>
                   </pic:nvPicPr>
                   <pic:blipFill>
@@ -336,32 +297,6 @@
     </w:p>
     <w:p>
       <w:pPr>
-        <w:spacing w:line="276" w:lineRule="auto"/>
-        <w:rPr>
-          <w:b w:val="1"/>
-        </w:rPr>
-      </w:pPr>
-      <w:r>
-        <w:rPr>
-          <w:rtl w:val="0"/>
-        </w:rPr>
-      </w:r>
-    </w:p>
-    <w:p>
-      <w:pPr>
-        <w:spacing w:line="276" w:lineRule="auto"/>
-        <w:rPr>
-          <w:b w:val="1"/>
-        </w:rPr>
-      </w:pPr>
-      <w:r>
-        <w:rPr>
-          <w:rtl w:val="0"/>
-        </w:rPr>
-      </w:r>
-    </w:p>
-    <w:p>
-      <w:pPr>
         <w:rPr/>
       </w:pPr>
       <w:r>
@@ -491,12 +426,12 @@
           <wp:inline distB="0" distT="0" distL="0" distR="0">
             <wp:extent cx="5943600" cy="897255"/>
             <wp:effectExtent b="0" l="0" r="0" t="0"/>
-            <wp:docPr id="2" name="image2.png"/>
+            <wp:docPr id="2" name="image4.png"/>
             <a:graphic>
               <a:graphicData uri="http://schemas.openxmlformats.org/drawingml/2006/picture">
                 <pic:pic>
                   <pic:nvPicPr>
-                    <pic:cNvPr id="0" name="image2.png"/>
+                    <pic:cNvPr id="0" name="image4.png"/>
                     <pic:cNvPicPr preferRelativeResize="0"/>
                   </pic:nvPicPr>
                   <pic:blipFill>
@@ -567,7 +502,7 @@
         <w:rPr>
           <w:rtl w:val="0"/>
         </w:rPr>
-        <w:t xml:space="preserve">: Port at which TCP_Forwarder  is listening.</w:t>
+        <w:t xml:space="preserve">: Port at which TCP_Forwarder is listening.</w:t>
       </w:r>
     </w:p>
     <w:p>
@@ -655,7 +590,7 @@
         <w:rPr>
           <w:rtl w:val="0"/>
         </w:rPr>
-        <w:t xml:space="preserve">docker build -t tcp_forwarder .</w:t>
+        <w:t xml:space="preserve">docker build -t tcp_forwarder </w:t>
       </w:r>
     </w:p>
     <w:p>
@@ -741,7 +676,7 @@
           <w:b w:val="1"/>
           <w:rtl w:val="0"/>
         </w:rPr>
-        <w:t xml:space="preserve">(refer 1.1)</w:t>
+        <w:t xml:space="preserve">(Refer 1.1)</w:t>
       </w:r>
     </w:p>
     <w:p>
@@ -899,7 +834,7 @@
         <w:rPr>
           <w:rtl w:val="0"/>
         </w:rPr>
-        <w:t xml:space="preserve">Update following values as shown in below image.</w:t>
+        <w:t xml:space="preserve">Update following values as shown in below image</w:t>
       </w:r>
     </w:p>
     <w:p>
@@ -913,12 +848,12 @@
           <wp:inline distB="114300" distT="114300" distL="114300" distR="114300">
             <wp:extent cx="5943600" cy="1981200"/>
             <wp:effectExtent b="0" l="0" r="0" t="0"/>
-            <wp:docPr id="3" name="image4.png"/>
+            <wp:docPr id="3" name="image5.png"/>
             <a:graphic>
               <a:graphicData uri="http://schemas.openxmlformats.org/drawingml/2006/picture">
                 <pic:pic>
                   <pic:nvPicPr>
-                    <pic:cNvPr id="0" name="image4.png"/>
+                    <pic:cNvPr id="0" name="image5.png"/>
                     <pic:cNvPicPr preferRelativeResize="0"/>
                   </pic:nvPicPr>
                   <pic:blipFill>
@@ -984,7 +919,14 @@
         <w:rPr>
           <w:rtl w:val="0"/>
         </w:rPr>
-        <w:t xml:space="preserve">url of the main server to which sub server should connect to it.(refer 1.1)</w:t>
+        <w:t xml:space="preserve">Url of the main server to which the sub server should connect to it.</w:t>
+      </w:r>
+      <w:r>
+        <w:rPr>
+          <w:b w:val="1"/>
+          <w:rtl w:val="0"/>
+        </w:rPr>
+        <w:t xml:space="preserve">(Refer 1.1)</w:t>
       </w:r>
     </w:p>
     <w:p>
@@ -1011,7 +953,7 @@
         <w:rPr>
           <w:rtl w:val="0"/>
         </w:rPr>
-        <w:t xml:space="preserve"> port at which sub server should listen . for the connection between the sub server and the  transcoding tool.</w:t>
+        <w:t xml:space="preserve"> Port at which the sub server should listen for the connection between the sub server and the  transcoding tool.</w:t>
       </w:r>
     </w:p>
     <w:p>
@@ -1038,7 +980,7 @@
         <w:rPr>
           <w:rtl w:val="0"/>
         </w:rPr>
-        <w:t xml:space="preserve">name of the sub server </w:t>
+        <w:t xml:space="preserve">Name of the sub server </w:t>
       </w:r>
     </w:p>
     <w:p>
@@ -1065,7 +1007,7 @@
         <w:rPr>
           <w:rtl w:val="0"/>
         </w:rPr>
-        <w:t xml:space="preserve"> (ed25519)signing public keys</w:t>
+        <w:t xml:space="preserve"> (ed25519)Signing public keys</w:t>
       </w:r>
     </w:p>
     <w:p>
@@ -1113,7 +1055,7 @@
         <w:rPr>
           <w:rtl w:val="0"/>
         </w:rPr>
-        <w:t xml:space="preserve"> url of the ipfs gateway</w:t>
+        <w:t xml:space="preserve"> Url of the IPFS gateway</w:t>
       </w:r>
     </w:p>
     <w:p>
@@ -1380,7 +1322,7 @@
         <w:rPr>
           <w:rtl w:val="0"/>
         </w:rPr>
-        <w:t xml:space="preserve">Update following values as shown in the below image.</w:t>
+        <w:t xml:space="preserve">Update following values as shown in the below image</w:t>
       </w:r>
     </w:p>
     <w:p>
@@ -1497,22 +1439,22 @@
           <w:szCs w:val="20"/>
           <w:rtl w:val="0"/>
         </w:rPr>
-        <w:t xml:space="preserve">url of the sub tcp server needed to connect </w:t>
-      </w:r>
-    </w:p>
-    <w:p>
-      <w:pPr>
-        <w:spacing w:line="276" w:lineRule="auto"/>
-        <w:rPr>
-          <w:b w:val="1"/>
-        </w:rPr>
-      </w:pPr>
-      <w:r>
-        <w:rPr>
-          <w:b w:val="1"/>
-          <w:rtl w:val="0"/>
-        </w:rPr>
-        <w:t xml:space="preserve">3.4 ipfs:</w:t>
+        <w:t xml:space="preserve">Url of the sub tcp server needed to connect </w:t>
+      </w:r>
+    </w:p>
+    <w:p>
+      <w:pPr>
+        <w:spacing w:line="276" w:lineRule="auto"/>
+        <w:rPr>
+          <w:b w:val="1"/>
+        </w:rPr>
+      </w:pPr>
+      <w:r>
+        <w:rPr>
+          <w:b w:val="1"/>
+          <w:rtl w:val="0"/>
+        </w:rPr>
+        <w:t xml:space="preserve">3.3 IPFS:</w:t>
       </w:r>
     </w:p>
     <w:p>
@@ -1537,7 +1479,7 @@
         <w:rPr>
           <w:rtl w:val="0"/>
         </w:rPr>
-        <w:t xml:space="preserve">: url of  IPFS gateway</w:t>
+        <w:t xml:space="preserve">: Url of  IPFS gateway</w:t>
       </w:r>
     </w:p>
     <w:p>
@@ -1562,7 +1504,7 @@
         <w:rPr>
           <w:rtl w:val="0"/>
         </w:rPr>
-        <w:t xml:space="preserve">:  CID of authorized tcp server keys  file . downloaded on server boot.</w:t>
+        <w:t xml:space="preserve">:  CID of authorized tcp server keys  file, downloaded on server boot.</w:t>
       </w:r>
     </w:p>
     <w:p>
@@ -1588,7 +1530,7 @@
         <w:rPr>
           <w:rtl w:val="0"/>
         </w:rPr>
-        <w:t xml:space="preserve">: path of stream config file stored in IPFS</w:t>
+        <w:t xml:space="preserve">: Path of stream config file stored in IPFS</w:t>
       </w:r>
     </w:p>
     <w:p>
@@ -1797,12 +1739,12 @@
           <wp:inline distB="114300" distT="114300" distL="114300" distR="114300">
             <wp:extent cx="5943600" cy="406400"/>
             <wp:effectExtent b="0" l="0" r="0" t="0"/>
-            <wp:docPr id="4" name="image5.png"/>
+            <wp:docPr id="4" name="image2.png"/>
             <a:graphic>
               <a:graphicData uri="http://schemas.openxmlformats.org/drawingml/2006/picture">
                 <pic:pic>
                   <pic:nvPicPr>
-                    <pic:cNvPr id="0" name="image5.png"/>
+                    <pic:cNvPr id="0" name="image2.png"/>
                     <pic:cNvPicPr preferRelativeResize="0"/>
                   </pic:nvPicPr>
                   <pic:blipFill>
@@ -1865,7 +1807,7 @@
           <w:szCs w:val="20"/>
           <w:rtl w:val="0"/>
         </w:rPr>
-        <w:t xml:space="preserve">url to which transcoding tool to connect (source :IPFS)</w:t>
+        <w:t xml:space="preserve">Url to which transcoding tool to connect (source :IPFS)</w:t>
       </w:r>
     </w:p>
     <w:p>
@@ -1941,11 +1883,20 @@
       </w:r>
       <w:r>
         <w:rPr>
+          <w:b w:val="1"/>
           <w:sz w:val="20"/>
           <w:szCs w:val="20"/>
           <w:rtl w:val="0"/>
         </w:rPr>
-        <w:t xml:space="preserve">4.1 Instruction for running video player and video-player-chrome-extension</w:t>
+        <w:t xml:space="preserve">4.1</w:t>
+      </w:r>
+      <w:r>
+        <w:rPr>
+          <w:sz w:val="20"/>
+          <w:szCs w:val="20"/>
+          <w:rtl w:val="0"/>
+        </w:rPr>
+        <w:t xml:space="preserve"> Instruction for running video player and video-player-chrome-extension</w:t>
       </w:r>
     </w:p>
     <w:p>
@@ -2457,22 +2408,22 @@
           <w:b w:val="1"/>
           <w:rtl w:val="0"/>
         </w:rPr>
-        <w:t xml:space="preserve">channelName : name of the channel </w:t>
-      </w:r>
-    </w:p>
-    <w:p>
-      <w:pPr>
-        <w:spacing w:line="276" w:lineRule="auto"/>
-        <w:rPr>
-          <w:b w:val="1"/>
-        </w:rPr>
-      </w:pPr>
-      <w:r>
-        <w:rPr>
-          <w:b w:val="1"/>
-          <w:rtl w:val="0"/>
-        </w:rPr>
-        <w:t xml:space="preserve">streamkey : (ed25519) public key </w:t>
+        <w:t xml:space="preserve">channelName : Name of the channel </w:t>
+      </w:r>
+    </w:p>
+    <w:p>
+      <w:pPr>
+        <w:spacing w:line="276" w:lineRule="auto"/>
+        <w:rPr>
+          <w:b w:val="1"/>
+        </w:rPr>
+      </w:pPr>
+      <w:r>
+        <w:rPr>
+          <w:b w:val="1"/>
+          <w:rtl w:val="0"/>
+        </w:rPr>
+        <w:t xml:space="preserve">streamkey : (ed25519) Public key </w:t>
       </w:r>
     </w:p>
     <w:p>
@@ -2804,7 +2755,7 @@
         <w:rPr>
           <w:rtl w:val="0"/>
         </w:rPr>
-        <w:t xml:space="preserve"> file is stored in every transcoding_tool  root folder, it is used for verifying  sub_server and it is downloaded from ipfs before server boot</w:t>
+        <w:t xml:space="preserve"> file is stored in every transcoding_tool root folder, it is used for verifying  sub_server and it is downloaded from ipfs before server boot</w:t>
       </w:r>
     </w:p>
     <w:p>
@@ -2850,7 +2801,7 @@
         <w:rPr>
           <w:rtl w:val="0"/>
         </w:rPr>
-        <w:t xml:space="preserve">name of the tcp server;</w:t>
+        <w:t xml:space="preserve">Name of the tcp server</w:t>
       </w:r>
     </w:p>
     <w:p>
@@ -2870,7 +2821,7 @@
         <w:rPr>
           <w:rtl w:val="0"/>
         </w:rPr>
-        <w:t xml:space="preserve"> public key </w:t>
+        <w:t xml:space="preserve"> Public key </w:t>
       </w:r>
     </w:p>
     <w:p>
@@ -3632,7 +3583,7 @@
         <w:rPr>
           <w:rtl w:val="0"/>
         </w:rPr>
-        <w:t xml:space="preserve">stream videos are stored in separate directory with channel name as per     the user .which needed to be updated manually</w:t>
+        <w:t xml:space="preserve">Stream videos are stored in a separate directory with channel name, as per the user which needs to be updated manually.</w:t>
       </w:r>
     </w:p>
     <w:p>
@@ -3646,13 +3597,13 @@
           <w:b w:val="1"/>
           <w:rtl w:val="0"/>
         </w:rPr>
-        <w:t xml:space="preserve">streamKey: (ed25519)</w:t>
-      </w:r>
-      <w:r>
-        <w:rPr>
-          <w:rtl w:val="0"/>
-        </w:rPr>
-        <w:t xml:space="preserve">pubic key</w:t>
+        <w:t xml:space="preserve">streamKey: (ed25519) </w:t>
+      </w:r>
+      <w:r>
+        <w:rPr>
+          <w:rtl w:val="0"/>
+        </w:rPr>
+        <w:t xml:space="preserve">Public key</w:t>
       </w:r>
     </w:p>
     <w:p>
@@ -3683,7 +3634,7 @@
           <w:szCs w:val="18"/>
           <w:rtl w:val="0"/>
         </w:rPr>
-        <w:t xml:space="preserve">Name of the streaming video. which should be updated manually </w:t>
+        <w:t xml:space="preserve">Name of the streaming video, which should be updated manually </w:t>
       </w:r>
     </w:p>
     <w:p>
@@ -3708,7 +3659,7 @@
           <w:szCs w:val="18"/>
           <w:rtl w:val="0"/>
         </w:rPr>
-        <w:t xml:space="preserve">URI of the photo thumbnail. which should be updated manually</w:t>
+        <w:t xml:space="preserve">URL of the photo thumbnail, which should be updated manually</w:t>
       </w:r>
     </w:p>
     <w:p>
@@ -3725,7 +3676,7 @@
           <w:b w:val="1"/>
           <w:rtl w:val="0"/>
         </w:rPr>
-        <w:t xml:space="preserve">    video_thumbnail:</w:t>
+        <w:t xml:space="preserve">    video_thumbnail: </w:t>
       </w:r>
       <w:r>
         <w:rPr>
@@ -3733,7 +3684,7 @@
           <w:szCs w:val="18"/>
           <w:rtl w:val="0"/>
         </w:rPr>
-        <w:t xml:space="preserve">URI of the video thumbnail. which should be updated manually</w:t>
+        <w:t xml:space="preserve">URL of the video thumbnail, which should be updated manually</w:t>
       </w:r>
       <w:r>
         <w:rPr>
@@ -3782,82 +3733,23 @@
       <w:pPr>
         <w:spacing w:line="276.00000208074397" w:lineRule="auto"/>
         <w:jc w:val="both"/>
-        <w:rPr>
-          <w:b w:val="1"/>
+        <w:rPr/>
+      </w:pPr>
+      <w:r>
+        <w:rPr>
+          <w:b w:val="1"/>
+          <w:rtl w:val="0"/>
+        </w:rPr>
+        <w:t xml:space="preserve">    ended_timeStamp: </w:t>
+      </w:r>
+      <w:r>
+        <w:rPr>
           <w:sz w:val="18"/>
           <w:szCs w:val="18"/>
-        </w:rPr>
-      </w:pPr>
-      <w:r>
-        <w:rPr>
-          <w:b w:val="1"/>
-          <w:rtl w:val="0"/>
-        </w:rPr>
-        <w:t xml:space="preserve">    ended_timeStamp:</w:t>
-      </w:r>
-      <w:r>
-        <w:rPr>
-          <w:sz w:val="18"/>
-          <w:szCs w:val="18"/>
-          <w:rtl w:val="0"/>
-        </w:rPr>
-        <w:t xml:space="preserve">Ended time frame of stream which is automatically updated by transcoding too</w:t>
-      </w:r>
-      <w:r>
-        <w:rPr>
-          <w:b w:val="1"/>
-          <w:sz w:val="18"/>
-          <w:szCs w:val="18"/>
-          <w:rtl w:val="0"/>
-        </w:rPr>
-        <w:t xml:space="preserve">l</w:t>
-      </w:r>
-    </w:p>
-    <w:p>
-      <w:pPr>
-        <w:spacing w:line="276.00000208074397" w:lineRule="auto"/>
-        <w:jc w:val="both"/>
-        <w:rPr>
-          <w:b w:val="1"/>
-        </w:rPr>
-      </w:pPr>
-      <w:r>
-        <w:rPr>
-          <w:b w:val="1"/>
-          <w:rtl w:val="0"/>
-        </w:rPr>
-        <w:t xml:space="preserve"> </w:t>
-      </w:r>
-    </w:p>
-    <w:p>
-      <w:pPr>
-        <w:spacing w:line="276" w:lineRule="auto"/>
-        <w:jc w:val="both"/>
-        <w:rPr/>
-      </w:pPr>
-      <w:r>
-        <w:rPr>
-          <w:rtl w:val="0"/>
-        </w:rPr>
-      </w:r>
-    </w:p>
-    <w:p>
-      <w:pPr>
-        <w:spacing w:line="276" w:lineRule="auto"/>
-        <w:jc w:val="both"/>
-        <w:rPr/>
-      </w:pPr>
-      <w:r>
-        <w:rPr>
-          <w:rtl w:val="0"/>
-        </w:rPr>
-      </w:r>
-    </w:p>
-    <w:p>
-      <w:pPr>
-        <w:spacing w:line="276" w:lineRule="auto"/>
-        <w:rPr/>
-      </w:pPr>
+          <w:rtl w:val="0"/>
+        </w:rPr>
+        <w:t xml:space="preserve">Ended time frame of stream which is automatically updated by transcoding tool</w:t>
+      </w:r>
       <w:r>
         <w:rPr>
           <w:rtl w:val="0"/>
@@ -4139,7 +4031,7 @@
           <w:szCs w:val="26"/>
           <w:rtl w:val="0"/>
         </w:rPr>
-        <w:t xml:space="preserve"> : file path  which needed to upload to IPFS</w:t>
+        <w:t xml:space="preserve"> : File path which needed to upload to IPFS</w:t>
       </w:r>
     </w:p>
     <w:p>
@@ -4165,7 +4057,7 @@
           <w:szCs w:val="26"/>
           <w:rtl w:val="0"/>
         </w:rPr>
-        <w:t xml:space="preserve"> : Name and Path of the file to save in IPFS</w:t>
+        <w:t xml:space="preserve"> : Name and path of the file to save in IPFS</w:t>
       </w:r>
       <w:r>
         <w:rPr>

</xml_diff>

<commit_message>
documentation update name change main tcp server to tcp forwarder
</commit_message>
<xml_diff>
--- a/docs/Migration to Phase 2 XT-Streaming.docx
+++ b/docs/Migration to Phase 2 XT-Streaming.docx
@@ -85,14 +85,14 @@
         <w:rPr/>
         <w:drawing>
           <wp:inline distB="114300" distT="114300" distL="114300" distR="114300">
-            <wp:extent cx="5943600" cy="4394200"/>
+            <wp:extent cx="5943600" cy="5651500"/>
             <wp:effectExtent b="0" l="0" r="0" t="0"/>
-            <wp:docPr id="1" name="image3.png"/>
+            <wp:docPr id="6" name="image2.png"/>
             <a:graphic>
               <a:graphicData uri="http://schemas.openxmlformats.org/drawingml/2006/picture">
                 <pic:pic>
                   <pic:nvPicPr>
-                    <pic:cNvPr id="0" name="image3.png"/>
+                    <pic:cNvPr id="0" name="image2.png"/>
                     <pic:cNvPicPr preferRelativeResize="0"/>
                   </pic:nvPicPr>
                   <pic:blipFill>
@@ -105,7 +105,7 @@
                   <pic:spPr>
                     <a:xfrm>
                       <a:off x="0" y="0"/>
-                      <a:ext cx="5943600" cy="4394200"/>
+                      <a:ext cx="5943600" cy="5651500"/>
                     </a:xfrm>
                     <a:prstGeom prst="rect"/>
                     <a:ln/>
@@ -260,7 +260,7 @@
           <wp:inline distB="114300" distT="114300" distL="114300" distR="114300">
             <wp:extent cx="6806856" cy="7864495"/>
             <wp:effectExtent b="0" l="0" r="0" t="0"/>
-            <wp:docPr id="5" name="image1.png"/>
+            <wp:docPr id="4" name="image1.png"/>
             <a:graphic>
               <a:graphicData uri="http://schemas.openxmlformats.org/drawingml/2006/picture">
                 <pic:pic>
@@ -426,12 +426,12 @@
           <wp:inline distB="0" distT="0" distL="0" distR="0">
             <wp:extent cx="5943600" cy="897255"/>
             <wp:effectExtent b="0" l="0" r="0" t="0"/>
-            <wp:docPr id="2" name="image4.png"/>
+            <wp:docPr id="1" name="image5.png"/>
             <a:graphic>
               <a:graphicData uri="http://schemas.openxmlformats.org/drawingml/2006/picture">
                 <pic:pic>
                   <pic:nvPicPr>
-                    <pic:cNvPr id="0" name="image4.png"/>
+                    <pic:cNvPr id="0" name="image5.png"/>
                     <pic:cNvPicPr preferRelativeResize="0"/>
                   </pic:nvPicPr>
                   <pic:blipFill>
@@ -848,12 +848,12 @@
           <wp:inline distB="114300" distT="114300" distL="114300" distR="114300">
             <wp:extent cx="5943600" cy="1981200"/>
             <wp:effectExtent b="0" l="0" r="0" t="0"/>
-            <wp:docPr id="3" name="image5.png"/>
+            <wp:docPr id="2" name="image3.png"/>
             <a:graphic>
               <a:graphicData uri="http://schemas.openxmlformats.org/drawingml/2006/picture">
                 <pic:pic>
                   <pic:nvPicPr>
-                    <pic:cNvPr id="0" name="image5.png"/>
+                    <pic:cNvPr id="0" name="image3.png"/>
                     <pic:cNvPicPr preferRelativeResize="0"/>
                   </pic:nvPicPr>
                   <pic:blipFill>
@@ -1336,7 +1336,7 @@
           <wp:inline distB="114300" distT="114300" distL="114300" distR="114300">
             <wp:extent cx="5943600" cy="6502400"/>
             <wp:effectExtent b="0" l="0" r="0" t="0"/>
-            <wp:docPr id="6" name="image6.png"/>
+            <wp:docPr id="5" name="image6.png"/>
             <a:graphic>
               <a:graphicData uri="http://schemas.openxmlformats.org/drawingml/2006/picture">
                 <pic:pic>
@@ -1739,12 +1739,12 @@
           <wp:inline distB="114300" distT="114300" distL="114300" distR="114300">
             <wp:extent cx="5943600" cy="406400"/>
             <wp:effectExtent b="0" l="0" r="0" t="0"/>
-            <wp:docPr id="4" name="image2.png"/>
+            <wp:docPr id="3" name="image4.png"/>
             <a:graphic>
               <a:graphicData uri="http://schemas.openxmlformats.org/drawingml/2006/picture">
                 <pic:pic>
                   <pic:nvPicPr>
-                    <pic:cNvPr id="0" name="image2.png"/>
+                    <pic:cNvPr id="0" name="image4.png"/>
                     <pic:cNvPicPr preferRelativeResize="0"/>
                   </pic:nvPicPr>
                   <pic:blipFill>

</xml_diff>